<commit_message>
them huong dan su dung
</commit_message>
<xml_diff>
--- a/baiWord.docx
+++ b/baiWord.docx
@@ -380,6 +380,458 @@
       <w:proofErr w:type="spellEnd"/>
       <w:r>
         <w:t xml:space="preserve"> 1 file.</w:t>
+      </w:r>
+    </w:p>
+    <w:p>
+      <w:proofErr w:type="spellStart"/>
+      <w:r>
+        <w:t>Hướng</w:t>
+      </w:r>
+      <w:proofErr w:type="spellEnd"/>
+      <w:r>
+        <w:t xml:space="preserve"> </w:t>
+      </w:r>
+      <w:proofErr w:type="spellStart"/>
+      <w:r>
+        <w:t>dẫn</w:t>
+      </w:r>
+      <w:proofErr w:type="spellEnd"/>
+      <w:r>
+        <w:t xml:space="preserve"> </w:t>
+      </w:r>
+      <w:proofErr w:type="spellStart"/>
+      <w:r>
+        <w:t>sử</w:t>
+      </w:r>
+      <w:proofErr w:type="spellEnd"/>
+      <w:r>
+        <w:t xml:space="preserve"> </w:t>
+      </w:r>
+      <w:proofErr w:type="spellStart"/>
+      <w:r>
+        <w:t>dụng</w:t>
+      </w:r>
+      <w:proofErr w:type="spellEnd"/>
+      <w:r>
+        <w:t xml:space="preserve"> :</w:t>
+      </w:r>
+    </w:p>
+    <w:p>
+      <w:pPr>
+        <w:pStyle w:val="ListParagraph"/>
+        <w:numPr>
+          <w:ilvl w:val="0"/>
+          <w:numId w:val="1"/>
+        </w:numPr>
+      </w:pPr>
+      <w:proofErr w:type="spellStart"/>
+      <w:r>
+        <w:t>Sử</w:t>
+      </w:r>
+      <w:proofErr w:type="spellEnd"/>
+      <w:r>
+        <w:t xml:space="preserve"> </w:t>
+      </w:r>
+      <w:proofErr w:type="spellStart"/>
+      <w:r>
+        <w:t>dụng</w:t>
+      </w:r>
+      <w:proofErr w:type="spellEnd"/>
+      <w:r>
+        <w:t xml:space="preserve"> bailam.cpp:</w:t>
+      </w:r>
+    </w:p>
+    <w:p>
+      <w:pPr>
+        <w:pStyle w:val="ListParagraph"/>
+        <w:numPr>
+          <w:ilvl w:val="1"/>
+          <w:numId w:val="1"/>
+        </w:numPr>
+      </w:pPr>
+      <w:proofErr w:type="spellStart"/>
+      <w:r>
+        <w:t>Chạy</w:t>
+      </w:r>
+      <w:proofErr w:type="spellEnd"/>
+      <w:r>
+        <w:t xml:space="preserve"> </w:t>
+      </w:r>
+      <w:proofErr w:type="spellStart"/>
+      <w:r>
+        <w:t>chương</w:t>
+      </w:r>
+      <w:proofErr w:type="spellEnd"/>
+      <w:r>
+        <w:t xml:space="preserve"> </w:t>
+      </w:r>
+      <w:proofErr w:type="spellStart"/>
+      <w:r>
+        <w:t>trình</w:t>
+      </w:r>
+      <w:proofErr w:type="spellEnd"/>
+      <w:r>
+        <w:t>.</w:t>
+      </w:r>
+    </w:p>
+    <w:p>
+      <w:pPr>
+        <w:pStyle w:val="ListParagraph"/>
+        <w:numPr>
+          <w:ilvl w:val="1"/>
+          <w:numId w:val="1"/>
+        </w:numPr>
+      </w:pPr>
+      <w:proofErr w:type="spellStart"/>
+      <w:r>
+        <w:t>Nhập</w:t>
+      </w:r>
+      <w:proofErr w:type="spellEnd"/>
+      <w:r>
+        <w:t xml:space="preserve"> </w:t>
+      </w:r>
+      <w:proofErr w:type="spellStart"/>
+      <w:r>
+        <w:t>vào</w:t>
+      </w:r>
+      <w:proofErr w:type="spellEnd"/>
+      <w:r>
+        <w:t xml:space="preserve"> 1 </w:t>
+      </w:r>
+      <w:proofErr w:type="spellStart"/>
+      <w:r>
+        <w:t>số</w:t>
+      </w:r>
+      <w:proofErr w:type="spellEnd"/>
+      <w:r>
+        <w:t xml:space="preserve"> </w:t>
+      </w:r>
+      <w:proofErr w:type="spellStart"/>
+      <w:r>
+        <w:t>nguyên</w:t>
+      </w:r>
+      <w:proofErr w:type="spellEnd"/>
+      <w:r>
+        <w:t>.</w:t>
+      </w:r>
+    </w:p>
+    <w:p>
+      <w:pPr>
+        <w:pStyle w:val="ListParagraph"/>
+        <w:numPr>
+          <w:ilvl w:val="1"/>
+          <w:numId w:val="1"/>
+        </w:numPr>
+      </w:pPr>
+      <w:proofErr w:type="spellStart"/>
+      <w:r>
+        <w:t>Nhấn</w:t>
+      </w:r>
+      <w:proofErr w:type="spellEnd"/>
+      <w:r>
+        <w:t xml:space="preserve"> enter</w:t>
+      </w:r>
+    </w:p>
+    <w:p>
+      <w:pPr>
+        <w:pStyle w:val="ListParagraph"/>
+        <w:numPr>
+          <w:ilvl w:val="1"/>
+          <w:numId w:val="1"/>
+        </w:numPr>
+      </w:pPr>
+      <w:proofErr w:type="spellStart"/>
+      <w:r>
+        <w:t>Hệ</w:t>
+      </w:r>
+      <w:proofErr w:type="spellEnd"/>
+      <w:r>
+        <w:t xml:space="preserve"> </w:t>
+      </w:r>
+      <w:proofErr w:type="spellStart"/>
+      <w:r>
+        <w:t>thống</w:t>
+      </w:r>
+      <w:proofErr w:type="spellEnd"/>
+      <w:r>
+        <w:t xml:space="preserve"> </w:t>
+      </w:r>
+      <w:proofErr w:type="spellStart"/>
+      <w:r>
+        <w:t>sẽ</w:t>
+      </w:r>
+      <w:proofErr w:type="spellEnd"/>
+      <w:r>
+        <w:t xml:space="preserve"> </w:t>
+      </w:r>
+      <w:proofErr w:type="spellStart"/>
+      <w:r>
+        <w:t>cho</w:t>
+      </w:r>
+      <w:proofErr w:type="spellEnd"/>
+      <w:r>
+        <w:t xml:space="preserve"> </w:t>
+      </w:r>
+      <w:proofErr w:type="spellStart"/>
+      <w:r>
+        <w:t>biết</w:t>
+      </w:r>
+      <w:proofErr w:type="spellEnd"/>
+      <w:r>
+        <w:t xml:space="preserve"> </w:t>
+      </w:r>
+      <w:proofErr w:type="spellStart"/>
+      <w:r>
+        <w:t>số</w:t>
+      </w:r>
+      <w:proofErr w:type="spellEnd"/>
+      <w:r>
+        <w:t xml:space="preserve"> </w:t>
+      </w:r>
+      <w:proofErr w:type="spellStart"/>
+      <w:r>
+        <w:t>đó</w:t>
+      </w:r>
+      <w:proofErr w:type="spellEnd"/>
+      <w:r>
+        <w:t xml:space="preserve"> </w:t>
+      </w:r>
+      <w:proofErr w:type="spellStart"/>
+      <w:r>
+        <w:t>là</w:t>
+      </w:r>
+      <w:proofErr w:type="spellEnd"/>
+      <w:r>
+        <w:t xml:space="preserve"> </w:t>
+      </w:r>
+      <w:proofErr w:type="spellStart"/>
+      <w:r>
+        <w:t>chẵn</w:t>
+      </w:r>
+      <w:proofErr w:type="spellEnd"/>
+      <w:r>
+        <w:t xml:space="preserve"> hay </w:t>
+      </w:r>
+      <w:proofErr w:type="spellStart"/>
+      <w:r>
+        <w:t>lẻ</w:t>
+      </w:r>
+      <w:proofErr w:type="spellEnd"/>
+      <w:r>
+        <w:t>.</w:t>
+      </w:r>
+    </w:p>
+    <w:p>
+      <w:pPr>
+        <w:pStyle w:val="ListParagraph"/>
+        <w:numPr>
+          <w:ilvl w:val="0"/>
+          <w:numId w:val="1"/>
+        </w:numPr>
+      </w:pPr>
+      <w:proofErr w:type="spellStart"/>
+      <w:r>
+        <w:t>Sử</w:t>
+      </w:r>
+      <w:proofErr w:type="spellEnd"/>
+      <w:r>
+        <w:t xml:space="preserve"> </w:t>
+      </w:r>
+      <w:proofErr w:type="spellStart"/>
+      <w:r>
+        <w:t>dụng</w:t>
+      </w:r>
+      <w:proofErr w:type="spellEnd"/>
+      <w:r>
+        <w:t xml:space="preserve"> script.sh:</w:t>
+      </w:r>
+    </w:p>
+    <w:p>
+      <w:pPr>
+        <w:pStyle w:val="ListParagraph"/>
+        <w:numPr>
+          <w:ilvl w:val="1"/>
+          <w:numId w:val="1"/>
+        </w:numPr>
+      </w:pPr>
+      <w:proofErr w:type="spellStart"/>
+      <w:r>
+        <w:t>Chạy</w:t>
+      </w:r>
+      <w:proofErr w:type="spellEnd"/>
+      <w:r>
+        <w:t xml:space="preserve">  file script.</w:t>
+      </w:r>
+    </w:p>
+    <w:p>
+      <w:pPr>
+        <w:pStyle w:val="ListParagraph"/>
+        <w:numPr>
+          <w:ilvl w:val="1"/>
+          <w:numId w:val="1"/>
+        </w:numPr>
+      </w:pPr>
+      <w:proofErr w:type="spellStart"/>
+      <w:r>
+        <w:t>Nhập</w:t>
+      </w:r>
+      <w:proofErr w:type="spellEnd"/>
+      <w:r>
+        <w:t xml:space="preserve"> </w:t>
+      </w:r>
+      <w:proofErr w:type="spellStart"/>
+      <w:r>
+        <w:t>vào</w:t>
+      </w:r>
+      <w:proofErr w:type="spellEnd"/>
+      <w:r>
+        <w:t xml:space="preserve"> 1 </w:t>
+      </w:r>
+      <w:proofErr w:type="spellStart"/>
+      <w:r>
+        <w:t>số</w:t>
+      </w:r>
+      <w:proofErr w:type="spellEnd"/>
+      <w:r>
+        <w:t xml:space="preserve"> </w:t>
+      </w:r>
+      <w:proofErr w:type="spellStart"/>
+      <w:r>
+        <w:t>nguyên</w:t>
+      </w:r>
+      <w:proofErr w:type="spellEnd"/>
+      <w:r>
+        <w:t>.</w:t>
+      </w:r>
+    </w:p>
+    <w:p>
+      <w:pPr>
+        <w:pStyle w:val="ListParagraph"/>
+        <w:numPr>
+          <w:ilvl w:val="1"/>
+          <w:numId w:val="1"/>
+        </w:numPr>
+      </w:pPr>
+      <w:proofErr w:type="spellStart"/>
+      <w:r>
+        <w:t>Nhấn</w:t>
+      </w:r>
+      <w:proofErr w:type="spellEnd"/>
+      <w:r>
+        <w:t xml:space="preserve"> enter.</w:t>
+      </w:r>
+    </w:p>
+    <w:p>
+      <w:pPr>
+        <w:pStyle w:val="ListParagraph"/>
+        <w:numPr>
+          <w:ilvl w:val="1"/>
+          <w:numId w:val="1"/>
+        </w:numPr>
+      </w:pPr>
+      <w:proofErr w:type="spellStart"/>
+      <w:r>
+        <w:t>Hệ</w:t>
+      </w:r>
+      <w:proofErr w:type="spellEnd"/>
+      <w:r>
+        <w:t xml:space="preserve"> </w:t>
+      </w:r>
+      <w:proofErr w:type="spellStart"/>
+      <w:r>
+        <w:t>thống</w:t>
+      </w:r>
+      <w:proofErr w:type="spellEnd"/>
+      <w:r>
+        <w:t xml:space="preserve"> </w:t>
+      </w:r>
+      <w:proofErr w:type="spellStart"/>
+      <w:r>
+        <w:t>sẽ</w:t>
+      </w:r>
+      <w:proofErr w:type="spellEnd"/>
+      <w:r>
+        <w:t xml:space="preserve"> </w:t>
+      </w:r>
+      <w:proofErr w:type="spellStart"/>
+      <w:r>
+        <w:t>cho</w:t>
+      </w:r>
+      <w:proofErr w:type="spellEnd"/>
+      <w:r>
+        <w:t xml:space="preserve"> </w:t>
+      </w:r>
+      <w:proofErr w:type="spellStart"/>
+      <w:r>
+        <w:t>biết</w:t>
+      </w:r>
+      <w:proofErr w:type="spellEnd"/>
+      <w:r>
+        <w:t xml:space="preserve"> </w:t>
+      </w:r>
+      <w:proofErr w:type="spellStart"/>
+      <w:r>
+        <w:t>số</w:t>
+      </w:r>
+      <w:proofErr w:type="spellEnd"/>
+      <w:r>
+        <w:t xml:space="preserve"> </w:t>
+      </w:r>
+      <w:proofErr w:type="spellStart"/>
+      <w:r>
+        <w:t>đó</w:t>
+      </w:r>
+      <w:proofErr w:type="spellEnd"/>
+      <w:r>
+        <w:t xml:space="preserve"> </w:t>
+      </w:r>
+      <w:proofErr w:type="spellStart"/>
+      <w:r>
+        <w:t>là</w:t>
+      </w:r>
+      <w:proofErr w:type="spellEnd"/>
+      <w:r>
+        <w:t xml:space="preserve"> </w:t>
+      </w:r>
+      <w:proofErr w:type="spellStart"/>
+      <w:r>
+        <w:t>số</w:t>
+      </w:r>
+      <w:proofErr w:type="spellEnd"/>
+      <w:r>
+        <w:t xml:space="preserve"> </w:t>
+      </w:r>
+      <w:proofErr w:type="spellStart"/>
+      <w:r>
+        <w:t>chẵn</w:t>
+      </w:r>
+      <w:proofErr w:type="spellEnd"/>
+      <w:r>
+        <w:t xml:space="preserve"> </w:t>
+      </w:r>
+      <w:proofErr w:type="spellStart"/>
+      <w:r>
+        <w:t>hau</w:t>
+      </w:r>
+      <w:proofErr w:type="spellEnd"/>
+      <w:r>
+        <w:t xml:space="preserve"> </w:t>
+      </w:r>
+      <w:proofErr w:type="spellStart"/>
+      <w:r>
+        <w:t>số</w:t>
+      </w:r>
+      <w:proofErr w:type="spellEnd"/>
+      <w:r>
+        <w:t xml:space="preserve"> </w:t>
+      </w:r>
+      <w:proofErr w:type="spellStart"/>
+      <w:r>
+        <w:t>lẻ</w:t>
+      </w:r>
+      <w:proofErr w:type="spellEnd"/>
+      <w:r>
+        <w:t>.</w:t>
       </w:r>
     </w:p>
     <w:sectPr>
@@ -409,7 +861,7 @@
         <w:rFonts w:ascii="Calibri" w:eastAsiaTheme="minorHAnsi" w:hAnsi="Calibri" w:cs="Calibri" w:hint="default"/>
       </w:rPr>
     </w:lvl>
-    <w:lvl w:ilvl="1" w:tplc="04090003" w:tentative="1">
+    <w:lvl w:ilvl="1" w:tplc="04090003">
       <w:start w:val="1"/>
       <w:numFmt w:val="bullet"/>
       <w:lvlText w:val="o"/>

</xml_diff>